<commit_message>
DB connection using SysProperties.getPropertyValue(key) in Database Util.
</commit_message>
<xml_diff>
--- a/Database Setup and CrudExample.docx
+++ b/Database Setup and CrudExample.docx
@@ -4,20 +4,7 @@
   <w:body>
     <w:p>
       <w:r>
-        <w:t xml:space="preserve">If your friend or a recruiter downloads your project, they will run </w:t>
-      </w:r>
-      <w:proofErr w:type="spellStart"/>
-      <w:r>
-        <w:t>jooq-</w:t>
-      </w:r>
-      <w:proofErr w:type="gramStart"/>
-      <w:r>
-        <w:t>codegen:generate</w:t>
-      </w:r>
-      <w:proofErr w:type="spellEnd"/>
-      <w:proofErr w:type="gramEnd"/>
-      <w:r>
-        <w:t xml:space="preserve"> on their own computer anyway. If you uploaded your copies to GitHub, their computer will try to generate them again, creating </w:t>
+        <w:t xml:space="preserve">If your friend or a recruiter downloads your project, they will run jooq-codegen:generate on their own computer anyway. If you uploaded your copies to GitHub, their computer will try to generate them again, creating </w:t>
       </w:r>
       <w:r>
         <w:rPr>
@@ -38,37 +25,8 @@
     </w:p>
     <w:p>
       <w:r>
-        <w:t xml:space="preserve">1.Install </w:t>
-      </w:r>
-      <w:proofErr w:type="spellStart"/>
-      <w:r>
-        <w:t>postgressql</w:t>
-      </w:r>
-      <w:proofErr w:type="spellEnd"/>
-      <w:r>
-        <w:t xml:space="preserve"> with password = </w:t>
-      </w:r>
-      <w:proofErr w:type="spellStart"/>
-      <w:r>
-        <w:t>postgres</w:t>
-      </w:r>
-      <w:proofErr w:type="spellEnd"/>
-      <w:r>
-        <w:t xml:space="preserve"> and username is also </w:t>
-      </w:r>
-      <w:proofErr w:type="spellStart"/>
-      <w:r>
-        <w:t>postgres</w:t>
-      </w:r>
-      <w:proofErr w:type="spellEnd"/>
-      <w:r>
-        <w:t xml:space="preserve"> </w:t>
-      </w:r>
-      <w:proofErr w:type="spellStart"/>
-      <w:r>
-        <w:t>defaultly</w:t>
-      </w:r>
-      <w:proofErr w:type="spellEnd"/>
+        <w:t>1.Install postgressql with password = postgres and username is also postgres defaultly</w:t>
+      </w:r>
     </w:p>
     <w:p>
       <w:r>
@@ -82,23 +40,7 @@
     </w:p>
     <w:p>
       <w:r>
-        <w:t>4.</w:t>
-      </w:r>
-      <w:proofErr w:type="gramStart"/>
-      <w:r>
-        <w:t>this above values</w:t>
-      </w:r>
-      <w:proofErr w:type="gramEnd"/>
-      <w:r>
-        <w:t xml:space="preserve"> used in </w:t>
-      </w:r>
-      <w:proofErr w:type="spellStart"/>
-      <w:r>
-        <w:t>intelliz</w:t>
-      </w:r>
-      <w:proofErr w:type="spellEnd"/>
-      <w:r>
-        <w:t xml:space="preserve"> java code to setup</w:t>
+        <w:t>4.this above values used in intelliz java code to setup</w:t>
       </w:r>
     </w:p>
     <w:p>
@@ -150,52 +92,12 @@
     </w:p>
     <w:p>
       <w:r>
-        <w:t xml:space="preserve">This will create the folder inside </w:t>
-      </w:r>
-      <w:proofErr w:type="spellStart"/>
-      <w:r>
-        <w:t>src</w:t>
-      </w:r>
-      <w:proofErr w:type="spellEnd"/>
-      <w:r>
-        <w:t xml:space="preserve"> -&gt; generated-sources -&gt;</w:t>
-      </w:r>
-      <w:proofErr w:type="spellStart"/>
-      <w:r>
-        <w:t>jooq</w:t>
-      </w:r>
-      <w:proofErr w:type="spellEnd"/>
-      <w:r>
-        <w:t xml:space="preserve"> when </w:t>
-      </w:r>
-      <w:proofErr w:type="spellStart"/>
-      <w:r>
-        <w:t>builded</w:t>
-      </w:r>
-      <w:proofErr w:type="spellEnd"/>
-      <w:r>
-        <w:t xml:space="preserve"> up for the first time and the tables created in </w:t>
-      </w:r>
-      <w:proofErr w:type="spellStart"/>
-      <w:r>
-        <w:t>jooq</w:t>
-      </w:r>
-      <w:proofErr w:type="spellEnd"/>
-      <w:r>
-        <w:t xml:space="preserve"> comes here as .java </w:t>
-      </w:r>
-    </w:p>
-    <w:p>
-      <w:r>
-        <w:t xml:space="preserve">The password and </w:t>
-      </w:r>
-      <w:proofErr w:type="spellStart"/>
-      <w:r>
-        <w:t>url</w:t>
-      </w:r>
-      <w:proofErr w:type="spellEnd"/>
-      <w:r>
-        <w:t xml:space="preserve"> should match our database:</w:t>
+        <w:t xml:space="preserve">This will create the folder inside src -&gt; generated-sources -&gt;jooq when builded up for the first time and the tables created in jooq comes here as .java </w:t>
+      </w:r>
+    </w:p>
+    <w:p>
+      <w:r>
+        <w:t>The password and url should match our database:</w:t>
       </w:r>
     </w:p>
     <w:p>
@@ -254,28 +156,7 @@
         <w:t>Run Maven-&gt;</w:t>
       </w:r>
       <w:r>
-        <w:t>plugins-&gt;</w:t>
-      </w:r>
-      <w:proofErr w:type="spellStart"/>
-      <w:r>
-        <w:t>jooq-</w:t>
-      </w:r>
-      <w:proofErr w:type="gramStart"/>
-      <w:r>
-        <w:t>codegen:generate</w:t>
-      </w:r>
-      <w:proofErr w:type="spellEnd"/>
-      <w:proofErr w:type="gramEnd"/>
-      <w:r>
-        <w:t xml:space="preserve">: (to update table from database to </w:t>
-      </w:r>
-      <w:proofErr w:type="spellStart"/>
-      <w:r>
-        <w:t>jooq</w:t>
-      </w:r>
-      <w:proofErr w:type="spellEnd"/>
-      <w:r>
-        <w:t>)</w:t>
+        <w:t>plugins-&gt;jooq-codegen:generate: (to update table from database to jooq)</w:t>
       </w:r>
     </w:p>
     <w:p>
@@ -336,23 +217,7 @@
     <w:p/>
     <w:p>
       <w:r>
-        <w:t xml:space="preserve">The tables created came into our directory </w:t>
-      </w:r>
-      <w:proofErr w:type="spellStart"/>
-      <w:r>
-        <w:t>src</w:t>
-      </w:r>
-      <w:proofErr w:type="spellEnd"/>
-      <w:r>
-        <w:t>-&gt;generated-sources -&gt;</w:t>
-      </w:r>
-      <w:proofErr w:type="spellStart"/>
-      <w:r>
-        <w:t>jooq</w:t>
-      </w:r>
-      <w:proofErr w:type="spellEnd"/>
-      <w:r>
-        <w:t>:</w:t>
+        <w:t>The tables created came into our directory src-&gt;generated-sources -&gt;jooq:</w:t>
       </w:r>
     </w:p>
     <w:p>
@@ -413,51 +278,17 @@
     <w:p/>
     <w:p>
       <w:r>
-        <w:t xml:space="preserve">We have </w:t>
-      </w:r>
-      <w:proofErr w:type="spellStart"/>
-      <w:r>
-        <w:t>GenericDB</w:t>
-      </w:r>
-      <w:proofErr w:type="spellEnd"/>
-      <w:r>
-        <w:t xml:space="preserve"> class which uses </w:t>
-      </w:r>
-      <w:proofErr w:type="spellStart"/>
-      <w:r>
-        <w:t>DatabaseConnectionPool</w:t>
-      </w:r>
-      <w:proofErr w:type="spellEnd"/>
-      <w:r>
-        <w:t xml:space="preserve"> and </w:t>
-      </w:r>
-      <w:proofErr w:type="spellStart"/>
-      <w:proofErr w:type="gramStart"/>
-      <w:r>
-        <w:t>DatabaseUtil</w:t>
-      </w:r>
-      <w:proofErr w:type="spellEnd"/>
-      <w:r>
-        <w:t xml:space="preserve">  which</w:t>
-      </w:r>
-      <w:proofErr w:type="gramEnd"/>
-      <w:r>
-        <w:t xml:space="preserve"> uses our twitter database </w:t>
-      </w:r>
-    </w:p>
-    <w:p/>
-    <w:p/>
-    <w:p/>
-    <w:p/>
-    <w:p/>
-    <w:p>
-      <w:proofErr w:type="spellStart"/>
-      <w:r>
-        <w:t>GenericDB</w:t>
-      </w:r>
-      <w:proofErr w:type="spellEnd"/>
-      <w:r>
-        <w:t xml:space="preserve"> uses those two classes and we have methods </w:t>
+        <w:t xml:space="preserve">We have GenericDB class which uses DatabaseConnectionPool and DatabaseUtil  which uses our twitter database </w:t>
+      </w:r>
+    </w:p>
+    <w:p/>
+    <w:p/>
+    <w:p/>
+    <w:p/>
+    <w:p/>
+    <w:p>
+      <w:r>
+        <w:t xml:space="preserve">GenericDB uses those two classes and we have methods </w:t>
       </w:r>
       <w:r>
         <w:t>(ctrl+fn+f12)</w:t>
@@ -508,13 +339,8 @@
     <w:p/>
     <w:p>
       <w:r>
-        <w:t xml:space="preserve">Created Coders.java class with the same attributes with a constructor and </w:t>
-      </w:r>
-      <w:proofErr w:type="spellStart"/>
-      <w:r>
-        <w:t>getmethods</w:t>
-      </w:r>
-      <w:proofErr w:type="spellEnd"/>
+        <w:t>Created Coders.java class with the same attributes with a constructor and getmethods</w:t>
+      </w:r>
     </w:p>
     <w:p/>
     <w:p>
@@ -525,59 +351,17 @@
     <w:p/>
     <w:p>
       <w:r>
-        <w:t xml:space="preserve">Which </w:t>
-      </w:r>
-      <w:proofErr w:type="gramStart"/>
-      <w:r>
-        <w:t>calls ,</w:t>
-      </w:r>
-      <w:proofErr w:type="gramEnd"/>
-    </w:p>
-    <w:p>
-      <w:proofErr w:type="gramStart"/>
-      <w:r>
-        <w:t>Coders</w:t>
-      </w:r>
-      <w:proofErr w:type="gramEnd"/>
-      <w:r>
-        <w:t xml:space="preserve"> coder = new </w:t>
-      </w:r>
-      <w:proofErr w:type="gramStart"/>
-      <w:r>
-        <w:t>Coders(</w:t>
-      </w:r>
-      <w:proofErr w:type="gramEnd"/>
-      <w:r>
-        <w:t>“varri yaswanth”,24);</w:t>
-      </w:r>
-    </w:p>
-    <w:p>
-      <w:r>
-        <w:t>new GenericDB&lt;Coders&gt;(</w:t>
-      </w:r>
-      <w:proofErr w:type="gramStart"/>
-      <w:r>
-        <w:t>).addRow</w:t>
-      </w:r>
-      <w:proofErr w:type="gramEnd"/>
-      <w:r>
-        <w:t>(</w:t>
-      </w:r>
-      <w:proofErr w:type="gramStart"/>
-      <w:r>
-        <w:t>tech.crawler</w:t>
-      </w:r>
-      <w:proofErr w:type="gramEnd"/>
-      <w:r>
-        <w:t>.</w:t>
-      </w:r>
-      <w:proofErr w:type="gramStart"/>
-      <w:r>
-        <w:t>tables.Coders.CODERS</w:t>
-      </w:r>
-      <w:proofErr w:type="gramEnd"/>
-      <w:r>
-        <w:t>,coder)</w:t>
+        <w:t>Which calls ,</w:t>
+      </w:r>
+    </w:p>
+    <w:p>
+      <w:r>
+        <w:t>Coders coder = new Coders(“varri yaswanth”,24);</w:t>
+      </w:r>
+    </w:p>
+    <w:p>
+      <w:r>
+        <w:t>new GenericDB&lt;Coders&gt;().addRow(tech.crawler.tables.Coders.CODERS,coder)</w:t>
       </w:r>
     </w:p>
     <w:p>
@@ -592,32 +376,7 @@
           <w:b/>
           <w:bCs/>
         </w:rPr>
-        <w:t xml:space="preserve">Run </w:t>
-      </w:r>
-      <w:proofErr w:type="spellStart"/>
-      <w:r>
-        <w:rPr>
-          <w:b/>
-          <w:bCs/>
-        </w:rPr>
-        <w:t>jooq-</w:t>
-      </w:r>
-      <w:proofErr w:type="gramStart"/>
-      <w:r>
-        <w:rPr>
-          <w:b/>
-          <w:bCs/>
-        </w:rPr>
-        <w:t>codegen:generate</w:t>
-      </w:r>
-      <w:proofErr w:type="spellEnd"/>
-      <w:proofErr w:type="gramEnd"/>
-      <w:r>
-        <w:rPr>
-          <w:b/>
-          <w:bCs/>
-        </w:rPr>
-        <w:t xml:space="preserve"> ONLY when:</w:t>
+        <w:t>Run jooq-codegen:generate ONLY when:</w:t>
       </w:r>
     </w:p>
     <w:p>
@@ -629,45 +388,17 @@
       </w:pPr>
       <w:r>
         <w:lastRenderedPageBreak/>
-        <w:t xml:space="preserve">You create a </w:t>
-      </w:r>
-      <w:proofErr w:type="gramStart"/>
-      <w:r>
-        <w:t xml:space="preserve">brand </w:t>
+        <w:t xml:space="preserve">You create a brand </w:t>
       </w:r>
       <w:r>
         <w:rPr>
           <w:b/>
           <w:bCs/>
         </w:rPr>
-        <w:t>new</w:t>
-      </w:r>
-      <w:proofErr w:type="gramEnd"/>
-      <w:r>
-        <w:rPr>
-          <w:b/>
-          <w:bCs/>
-        </w:rPr>
-        <w:t xml:space="preserve"> table</w:t>
-      </w:r>
-      <w:r>
-        <w:t xml:space="preserve"> in </w:t>
-      </w:r>
-      <w:proofErr w:type="spellStart"/>
-      <w:r>
-        <w:t>pgAdmin</w:t>
-      </w:r>
-      <w:proofErr w:type="spellEnd"/>
-      <w:r>
-        <w:t xml:space="preserve"> (e.g., when you create a </w:t>
-      </w:r>
-      <w:proofErr w:type="spellStart"/>
-      <w:r>
-        <w:t>wiki_pages</w:t>
-      </w:r>
-      <w:proofErr w:type="spellEnd"/>
-      <w:r>
-        <w:t xml:space="preserve"> table later).</w:t>
+        <w:t>new table</w:t>
+      </w:r>
+      <w:r>
+        <w:t xml:space="preserve"> in pgAdmin (e.g., when you create a wiki_pages table later).</w:t>
       </w:r>
     </w:p>
     <w:p>
@@ -688,15 +419,7 @@
         <w:t>alter an existing table</w:t>
       </w:r>
       <w:r>
-        <w:t xml:space="preserve"> (e.g., adding a new column like </w:t>
-      </w:r>
-      <w:proofErr w:type="spellStart"/>
-      <w:r>
-        <w:t>image_url</w:t>
-      </w:r>
-      <w:proofErr w:type="spellEnd"/>
-      <w:r>
-        <w:t xml:space="preserve"> or changing a column's data type).</w:t>
+        <w:t xml:space="preserve"> (e.g., adding a new column like image_url or changing a column's data type).</w:t>
       </w:r>
     </w:p>
     <w:p>
@@ -726,7 +449,7 @@
           <w:noProof/>
         </w:rPr>
         <w:drawing>
-          <wp:inline distT="0" distB="0" distL="0" distR="0" wp14:anchorId="4DF63B99" wp14:editId="0766893C">
+          <wp:inline distT="0" distB="0" distL="0" distR="0" wp14:anchorId="4DF63B99" wp14:editId="3472E3F0">
             <wp:extent cx="5731510" cy="2954020"/>
             <wp:effectExtent l="0" t="0" r="2540" b="0"/>
             <wp:docPr id="703504872" name="Picture 5"/>
@@ -778,15 +501,7 @@
     <w:p/>
     <w:p>
       <w:r>
-        <w:t xml:space="preserve">Data passed </w:t>
-      </w:r>
-      <w:proofErr w:type="gramStart"/>
-      <w:r>
-        <w:t>to  table</w:t>
-      </w:r>
-      <w:proofErr w:type="gramEnd"/>
-      <w:r>
-        <w:t>:</w:t>
+        <w:t>Data passed to  table:</w:t>
       </w:r>
     </w:p>
     <w:p>
@@ -933,15 +648,7 @@
         <w:t xml:space="preserve"> </w:t>
       </w:r>
       <w:r>
-        <w:t>GenericDB&lt;String</w:t>
-      </w:r>
-      <w:proofErr w:type="gramStart"/>
-      <w:r>
-        <w:t>&gt;().updateColumn</w:t>
-      </w:r>
-      <w:proofErr w:type="gramEnd"/>
-      <w:r>
-        <w:t>(tech.crawler.tables.Coders.</w:t>
+        <w:t>GenericDB&lt;String&gt;().updateColumn(tech.crawler.tables.Coders.</w:t>
       </w:r>
       <w:r>
         <w:rPr>
@@ -951,20 +658,7 @@
         <w:t>CODERS</w:t>
       </w:r>
       <w:r>
-        <w:t xml:space="preserve">.NAME,"Sadie Varri", </w:t>
-      </w:r>
-      <w:proofErr w:type="spellStart"/>
-      <w:proofErr w:type="gramStart"/>
-      <w:r>
-        <w:t>tech.crawler</w:t>
-      </w:r>
-      <w:proofErr w:type="gramEnd"/>
-      <w:r>
-        <w:t>.</w:t>
-      </w:r>
-      <w:proofErr w:type="gramStart"/>
-      <w:r>
-        <w:t>tables.Coders.</w:t>
+        <w:t>.NAME,"Sadie Varri", tech.crawler.tables.Coders.</w:t>
       </w:r>
       <w:r>
         <w:rPr>
@@ -973,14 +667,8 @@
         </w:rPr>
         <w:t>CODERS</w:t>
       </w:r>
-      <w:proofErr w:type="spellEnd"/>
-      <w:proofErr w:type="gramEnd"/>
-      <w:r>
-        <w:t xml:space="preserve">, </w:t>
-      </w:r>
-      <w:proofErr w:type="spellStart"/>
-      <w:r>
-        <w:t>tech.crawler.tables.Coders.</w:t>
+      <w:r>
+        <w:t>, tech.crawler.tables.Coders.</w:t>
       </w:r>
       <w:r>
         <w:rPr>
@@ -990,11 +678,7 @@
         <w:t>CODERS</w:t>
       </w:r>
       <w:r>
-        <w:t>.NAME.eq</w:t>
-      </w:r>
-      <w:proofErr w:type="spellEnd"/>
-      <w:r>
-        <w:t>("spammer"));</w:t>
+        <w:t>.NAME.eq("spammer"));</w:t>
       </w:r>
     </w:p>
     <w:p>
@@ -1084,6 +768,178 @@
                     <a:xfrm>
                       <a:off x="0" y="0"/>
                       <a:ext cx="5731510" cy="3033395"/>
+                    </a:xfrm>
+                    <a:prstGeom prst="rect">
+                      <a:avLst/>
+                    </a:prstGeom>
+                  </pic:spPr>
+                </pic:pic>
+              </a:graphicData>
+            </a:graphic>
+          </wp:inline>
+        </w:drawing>
+      </w:r>
+    </w:p>
+    <w:p/>
+    <w:p>
+      <w:r>
+        <w:t>Setted the Sysproperties.java file to get the values of DB_USERNAME and DB_PASSWORD:</w:t>
+      </w:r>
+    </w:p>
+    <w:p>
+      <w:r>
+        <w:rPr>
+          <w:noProof/>
+        </w:rPr>
+        <w:drawing>
+          <wp:inline distT="0" distB="0" distL="0" distR="0" wp14:anchorId="070C09EB" wp14:editId="619BE37C">
+            <wp:extent cx="5731510" cy="1909445"/>
+            <wp:effectExtent l="0" t="0" r="2540" b="0"/>
+            <wp:docPr id="1652345162" name="Picture 1"/>
+            <wp:cNvGraphicFramePr>
+              <a:graphicFrameLocks xmlns:a="http://schemas.openxmlformats.org/drawingml/2006/main" noChangeAspect="1"/>
+            </wp:cNvGraphicFramePr>
+            <a:graphic xmlns:a="http://schemas.openxmlformats.org/drawingml/2006/main">
+              <a:graphicData uri="http://schemas.openxmlformats.org/drawingml/2006/picture">
+                <pic:pic xmlns:pic="http://schemas.openxmlformats.org/drawingml/2006/picture">
+                  <pic:nvPicPr>
+                    <pic:cNvPr id="0" name="Picture 1"/>
+                    <pic:cNvPicPr>
+                      <a:picLocks noChangeAspect="1" noChangeArrowheads="1"/>
+                    </pic:cNvPicPr>
+                  </pic:nvPicPr>
+                  <pic:blipFill>
+                    <a:blip r:embed="rId15" cstate="print">
+                      <a:extLst>
+                        <a:ext uri="{28A0092B-C50C-407E-A947-70E740481C1C}">
+                          <a14:useLocalDpi xmlns:a14="http://schemas.microsoft.com/office/drawing/2010/main" val="0"/>
+                        </a:ext>
+                      </a:extLst>
+                    </a:blip>
+                    <a:srcRect/>
+                    <a:stretch>
+                      <a:fillRect/>
+                    </a:stretch>
+                  </pic:blipFill>
+                  <pic:spPr bwMode="auto">
+                    <a:xfrm>
+                      <a:off x="0" y="0"/>
+                      <a:ext cx="5731510" cy="1909445"/>
+                    </a:xfrm>
+                    <a:prstGeom prst="rect">
+                      <a:avLst/>
+                    </a:prstGeom>
+                    <a:noFill/>
+                    <a:ln>
+                      <a:noFill/>
+                    </a:ln>
+                  </pic:spPr>
+                </pic:pic>
+              </a:graphicData>
+            </a:graphic>
+          </wp:inline>
+        </w:drawing>
+      </w:r>
+    </w:p>
+    <w:p/>
+    <w:p>
+      <w:r>
+        <w:t>Here the key  “DB_USERNAME” and “DB_PASSWORD” are just the keys they are assignmed with values inside application.properties</w:t>
+      </w:r>
+    </w:p>
+    <w:p>
+      <w:r>
+        <w:rPr>
+          <w:noProof/>
+        </w:rPr>
+        <w:drawing>
+          <wp:inline distT="0" distB="0" distL="0" distR="0" wp14:anchorId="0C143D21" wp14:editId="0E80AE60">
+            <wp:extent cx="5731510" cy="1029335"/>
+            <wp:effectExtent l="0" t="0" r="2540" b="0"/>
+            <wp:docPr id="1247211217" name="Picture 2"/>
+            <wp:cNvGraphicFramePr>
+              <a:graphicFrameLocks xmlns:a="http://schemas.openxmlformats.org/drawingml/2006/main" noChangeAspect="1"/>
+            </wp:cNvGraphicFramePr>
+            <a:graphic xmlns:a="http://schemas.openxmlformats.org/drawingml/2006/main">
+              <a:graphicData uri="http://schemas.openxmlformats.org/drawingml/2006/picture">
+                <pic:pic xmlns:pic="http://schemas.openxmlformats.org/drawingml/2006/picture">
+                  <pic:nvPicPr>
+                    <pic:cNvPr id="0" name="Picture 2"/>
+                    <pic:cNvPicPr>
+                      <a:picLocks noChangeAspect="1" noChangeArrowheads="1"/>
+                    </pic:cNvPicPr>
+                  </pic:nvPicPr>
+                  <pic:blipFill>
+                    <a:blip r:embed="rId16">
+                      <a:extLst>
+                        <a:ext uri="{28A0092B-C50C-407E-A947-70E740481C1C}">
+                          <a14:useLocalDpi xmlns:a14="http://schemas.microsoft.com/office/drawing/2010/main" val="0"/>
+                        </a:ext>
+                      </a:extLst>
+                    </a:blip>
+                    <a:srcRect/>
+                    <a:stretch>
+                      <a:fillRect/>
+                    </a:stretch>
+                  </pic:blipFill>
+                  <pic:spPr bwMode="auto">
+                    <a:xfrm>
+                      <a:off x="0" y="0"/>
+                      <a:ext cx="5731510" cy="1029335"/>
+                    </a:xfrm>
+                    <a:prstGeom prst="rect">
+                      <a:avLst/>
+                    </a:prstGeom>
+                    <a:noFill/>
+                    <a:ln>
+                      <a:noFill/>
+                    </a:ln>
+                  </pic:spPr>
+                </pic:pic>
+              </a:graphicData>
+            </a:graphic>
+          </wp:inline>
+        </w:drawing>
+      </w:r>
+    </w:p>
+    <w:p>
+      <w:r>
+        <w:t>Ran the TestCoders to add Row and checking that SysProperties.getPropertyValue() fetching the right username and password of the passing keys and the url database util is working if this changes are made or not:</w:t>
+      </w:r>
+    </w:p>
+    <w:p>
+      <w:r>
+        <w:lastRenderedPageBreak/>
+        <w:t>Yes working new row added,</w:t>
+      </w:r>
+    </w:p>
+    <w:p>
+      <w:r>
+        <w:drawing>
+          <wp:inline distT="0" distB="0" distL="0" distR="0" wp14:anchorId="6306CF16" wp14:editId="61D5C964">
+            <wp:extent cx="5731510" cy="3756660"/>
+            <wp:effectExtent l="0" t="0" r="2540" b="0"/>
+            <wp:docPr id="786551399" name="Picture 1"/>
+            <wp:cNvGraphicFramePr>
+              <a:graphicFrameLocks xmlns:a="http://schemas.openxmlformats.org/drawingml/2006/main" noChangeAspect="1"/>
+            </wp:cNvGraphicFramePr>
+            <a:graphic xmlns:a="http://schemas.openxmlformats.org/drawingml/2006/main">
+              <a:graphicData uri="http://schemas.openxmlformats.org/drawingml/2006/picture">
+                <pic:pic xmlns:pic="http://schemas.openxmlformats.org/drawingml/2006/picture">
+                  <pic:nvPicPr>
+                    <pic:cNvPr id="786551399" name=""/>
+                    <pic:cNvPicPr/>
+                  </pic:nvPicPr>
+                  <pic:blipFill>
+                    <a:blip r:embed="rId17"/>
+                    <a:stretch>
+                      <a:fillRect/>
+                    </a:stretch>
+                  </pic:blipFill>
+                  <pic:spPr>
+                    <a:xfrm>
+                      <a:off x="0" y="0"/>
+                      <a:ext cx="5731510" cy="3756660"/>
                     </a:xfrm>
                     <a:prstGeom prst="rect">
                       <a:avLst/>
@@ -1867,6 +1723,7 @@
   <w:style w:type="character" w:default="1" w:styleId="DefaultParagraphFont">
     <w:name w:val="Default Paragraph Font"/>
     <w:uiPriority w:val="1"/>
+    <w:semiHidden/>
     <w:unhideWhenUsed/>
   </w:style>
   <w:style w:type="table" w:default="1" w:styleId="TableNormal">

</xml_diff>